<commit_message>
Add the round-2 changes described in 4baa67f
4baa67f's message describes this work, but a failed `git add` meant that
commit only moved the Grafana screenshot into docs/images/stack/. This
commit adds the rest:

- simulator/physiology.py (realistic, correlated, labelled vitals) driving
  the event stream; agent/tools/early_warning.py (NEWS2).
- Model v2 retrained on stable simulated patients (v1 kept); four-detector
  evaluation; at NEWS2's 1.8% false-alarm rate v2 catches 61% vs 47%.
  Promoted as a calibrated third layer (ml/models/vitals_anomaly_calibration.json).
- score_vitals_anomaly: rules, NEWS2, model layers; 66% caught at 3.8%
  false alarms. Simulated physiology only, not real patients.
- docs/results.md (generated, staleness-tested), stack screenshots,
  dashboard detector panels, per-tool span names, updated docs.

427 tests pass.

Co-Authored-By: Claude Opus 5.5 <noreply@anthropic.com>
</commit_message>
<xml_diff>
--- a/docs/workflow_and_tech_stack.docx
+++ b/docs/workflow_and_tech_stack.docx
@@ -352,7 +352,7 @@
                 <w:b w:val="0"/>
                 <w:sz w:val="17"/>
               </w:rPr>
-              <w:t>Data and anomaly model</w:t>
+              <w:t>Data and deterioration detection</w:t>
             </w:r>
           </w:p>
         </w:tc>
@@ -370,7 +370,7 @@
                 <w:b w:val="0"/>
                 <w:sz w:val="17"/>
               </w:rPr>
-              <w:t>Measured - EDA done; model worse than the range rule, so rules decide</w:t>
+              <w:t>Measured - EDA done; with realistic physiology, model v2 + NEWS2 + rules catch 66% at 3.8% false alarms (simulated)</w:t>
             </w:r>
           </w:p>
         </w:tc>
@@ -4089,7 +4089,7 @@
                 <w:b w:val="0"/>
                 <w:sz w:val="17"/>
               </w:rPr>
-              <w:t>Anomaly model</w:t>
+              <w:t>Detectors</w:t>
             </w:r>
           </w:p>
         </w:tc>
@@ -4123,7 +4123,7 @@
                 <w:b w:val="0"/>
                 <w:sz w:val="17"/>
               </w:rPr>
-              <w:t>26% of single out-of-band vitals (rule 100%); 1-7% of joint patterns</w:t>
+              <w:t>Round 1: model v1 worse than the range rule. Round 2: v2 61% vs NEWS2 47% at equal false alarms</w:t>
             </w:r>
           </w:p>
         </w:tc>
@@ -4158,7 +4158,7 @@
                 <w:b w:val="0"/>
                 <w:sz w:val="17"/>
               </w:rPr>
-              <w:t>Measured - model now advisory</w:t>
+              <w:t>Measured - v2 promoted as a calibrated third layer</w:t>
             </w:r>
           </w:p>
         </w:tc>
@@ -5707,7 +5707,7 @@
                 <w:b w:val="0"/>
                 <w:sz w:val="17"/>
               </w:rPr>
-              <w:t>uv-only package management, lint, 385 tests with zero network calls</w:t>
+              <w:t>uv-only package management, lint, 427 tests with zero network calls</w:t>
             </w:r>
           </w:p>
         </w:tc>
@@ -7248,7 +7248,7 @@
                 <w:b w:val="0"/>
                 <w:sz w:val="17"/>
               </w:rPr>
-              <w:t>IsolationForest -&gt; MLflow -&gt; ONNX</w:t>
+              <w:t>IsolationForest -&gt; MLflow -&gt; ONNX; NEWS2</w:t>
             </w:r>
           </w:p>
         </w:tc>
@@ -7282,7 +7282,7 @@
                 <w:b w:val="0"/>
                 <w:sz w:val="17"/>
               </w:rPr>
-              <w:t>Vitals anomaly score; rules decide, model adds</w:t>
+              <w:t>Deterioration: rules, NEWS2, then model v2 at a calibrated threshold</w:t>
             </w:r>
           </w:p>
         </w:tc>
@@ -7299,25 +7299,130 @@
                 <w:b w:val="0"/>
                 <w:sz w:val="17"/>
               </w:rPr>
-              <w:t>ml/, agent/tools/anomaly_score.py</w:t>
+              <w:t>ml/, agent/tools/anomaly_score.py, early_warning.py</w:t>
             </w:r>
           </w:p>
         </w:tc>
         <w:tc>
           <w:tcPr>
             <w:tcW w:type="dxa" w:w="1871"/>
-            <w:shd w:val="clear" w:color="auto" w:fill="fdf1c7"/>
-          </w:tcPr>
-          <w:p>
-            <w:pPr>
-              <w:spacing w:after="0"/>
-            </w:pPr>
-            <w:r>
-              <w:rPr>
-                <w:b w:val="0"/>
-                <w:sz w:val="17"/>
-              </w:rPr>
-              <w:t>Advisory - evaluated: misses most of what the range rule catches</w:t>
+            <w:shd w:val="clear" w:color="auto" w:fill="d5f0dc"/>
+          </w:tcPr>
+          <w:p>
+            <w:pPr>
+              <w:spacing w:after="0"/>
+            </w:pPr>
+            <w:r>
+              <w:rPr>
+                <w:b w:val="0"/>
+                <w:sz w:val="17"/>
+              </w:rPr>
+              <w:t>Measured - v2 catches 61% vs NEWS2 47% at the same false alarms (simulated)</w:t>
+            </w:r>
+          </w:p>
+        </w:tc>
+      </w:tr>
+      <w:tr>
+        <w:tc>
+          <w:tcPr>
+            <w:tcW w:type="dxa" w:w="1701"/>
+          </w:tcPr>
+          <w:p>
+            <w:pPr>
+              <w:spacing w:after="0"/>
+            </w:pPr>
+            <w:r>
+              <w:rPr>
+                <w:b w:val="0"/>
+                <w:sz w:val="17"/>
+              </w:rPr>
+              <w:t>Simulator physiology</w:t>
+            </w:r>
+          </w:p>
+        </w:tc>
+        <w:tc>
+          <w:tcPr>
+            <w:tcW w:type="dxa" w:w="2835"/>
+          </w:tcPr>
+          <w:p>
+            <w:pPr>
+              <w:spacing w:after="0"/>
+            </w:pPr>
+            <w:r>
+              <w:rPr>
+                <w:b w:val="0"/>
+                <w:sz w:val="17"/>
+              </w:rPr>
+              <w:t>Per-patient baselines, unit acuity, deterioration episodes</w:t>
+            </w:r>
+          </w:p>
+        </w:tc>
+        <w:tc>
+          <w:tcPr>
+            <w:tcW w:type="dxa" w:w="2381"/>
+          </w:tcPr>
+          <w:p>
+            <w:pPr>
+              <w:spacing w:after="0"/>
+            </w:pPr>
+            <w:r>
+              <w:rPr>
+                <w:b w:val="0"/>
+                <w:sz w:val="17"/>
+              </w:rPr>
+              <w:t>-</w:t>
+            </w:r>
+          </w:p>
+        </w:tc>
+        <w:tc>
+          <w:tcPr>
+            <w:tcW w:type="dxa" w:w="3515"/>
+          </w:tcPr>
+          <w:p>
+            <w:pPr>
+              <w:spacing w:after="0"/>
+            </w:pPr>
+            <w:r>
+              <w:rPr>
+                <w:b w:val="0"/>
+                <w:sz w:val="17"/>
+              </w:rPr>
+              <w:t>Realistic, labelled vitals for training and evaluation</w:t>
+            </w:r>
+          </w:p>
+        </w:tc>
+        <w:tc>
+          <w:tcPr>
+            <w:tcW w:type="dxa" w:w="2835"/>
+          </w:tcPr>
+          <w:p>
+            <w:pPr>
+              <w:spacing w:after="0"/>
+            </w:pPr>
+            <w:r>
+              <w:rPr>
+                <w:b w:val="0"/>
+                <w:sz w:val="17"/>
+              </w:rPr>
+              <w:t>simulator/physiology.py</w:t>
+            </w:r>
+          </w:p>
+        </w:tc>
+        <w:tc>
+          <w:tcPr>
+            <w:tcW w:type="dxa" w:w="1871"/>
+            <w:shd w:val="clear" w:color="auto" w:fill="d5f0dc"/>
+          </w:tcPr>
+          <w:p>
+            <w:pPr>
+              <w:spacing w:after="0"/>
+            </w:pPr>
+            <w:r>
+              <w:rPr>
+                <w:b w:val="0"/>
+                <w:sz w:val="17"/>
+              </w:rPr>
+              <w:t>Tested locally - Databricks data predates it</w:t>
             </w:r>
           </w:p>
         </w:tc>
@@ -8892,7 +8997,7 @@
                 <w:b w:val="0"/>
                 <w:sz w:val="17"/>
               </w:rPr>
-              <w:t>Rules before models</w:t>
+              <w:t>Rules, then NEWS2, then a calibrated model</w:t>
             </w:r>
           </w:p>
         </w:tc>
@@ -8909,7 +9014,7 @@
                 <w:b w:val="0"/>
                 <w:sz w:val="17"/>
               </w:rPr>
-              <w:t>An anomaly model's miss hiding a dangerous reading</w:t>
+              <w:t>A model's miss hiding a dangerous reading (v2 scores SpO2 80 as normal)</w:t>
             </w:r>
           </w:p>
         </w:tc>
@@ -9694,7 +9799,7 @@
                 <w:b w:val="0"/>
                 <w:sz w:val="17"/>
               </w:rPr>
-              <w:t>385 tests, one file per concern, zero network calls</w:t>
+              <w:t>427 tests, one file per concern, zero network calls</w:t>
             </w:r>
           </w:p>
         </w:tc>
@@ -9891,7 +9996,7 @@
                 <w:b w:val="0"/>
                 <w:sz w:val="17"/>
               </w:rPr>
-              <w:t>Realistic vitals in the simulator; retrain the anomaly model; compare with rules and NEWS2</w:t>
+              <w:t>Regenerate the dataset with the physiology simulator and re-run the pipeline and golden set</w:t>
             </w:r>
           </w:p>
         </w:tc>
@@ -9908,7 +10013,7 @@
                 <w:b w:val="0"/>
                 <w:sz w:val="17"/>
               </w:rPr>
-              <w:t>-</w:t>
+              <w:t>Databricks login</w:t>
             </w:r>
           </w:p>
         </w:tc>
@@ -9925,7 +10030,7 @@
                 <w:b w:val="0"/>
                 <w:sz w:val="17"/>
               </w:rPr>
-              <w:t>A model that earns its place, or evidence it shouldn't</w:t>
+              <w:t>Databricks data matches the simulator</w:t>
             </w:r>
           </w:p>
         </w:tc>

</xml_diff>

<commit_message>
Flag patient identity conflicts in Silver (problem catalog M2)
The EDA found all 13 readmitted patients came back with a different name
and birth date under the same patient_id; SCD1 dim_patients then shows the
latest person for every encounter.

- silver_patient_admissions: append-only admissions with their demographic
  snapshot, downstream of the contract gate.
- silver_patient_identity_conflicts: readmitted patient_ids with more than
  one name or birth date (counts only, no names), with a warn-only
  one_identity_per_patient_id expectation so the event log records them.
  Never dropped or merged; a data steward decides.
- Catalog M2 covers this case (status partial); lookup_problem splits
  identifier tokens so an expectation name finds its problem.

Graph-tested; not yet run on the workspace. 429 tests pass.

Co-Authored-By: Claude Opus 5.5 <noreply@anthropic.com>
</commit_message>
<xml_diff>
--- a/docs/workflow_and_tech_stack.docx
+++ b/docs/workflow_and_tech_stack.docx
@@ -5707,7 +5707,7 @@
                 <w:b w:val="0"/>
                 <w:sz w:val="17"/>
               </w:rPr>
-              <w:t>uv-only package management, lint, 427 tests with zero network calls</w:t>
+              <w:t>uv-only package management, lint, 429 tests with zero network calls</w:t>
             </w:r>
           </w:p>
         </w:tc>
@@ -9799,7 +9799,7 @@
                 <w:b w:val="0"/>
                 <w:sz w:val="17"/>
               </w:rPr>
-              <w:t>427 tests, one file per concern, zero network calls</w:t>
+              <w:t>429 tests, one file per concern, zero network calls</w:t>
             </w:r>
           </w:p>
         </w:tc>

</xml_diff>

<commit_message>
Identity matching for nicknames and new surnames; steward review queue
A fourth Silver check (silver_patient_name_change_candidates) pairs
registrations with the same birth date, gender and formal first name
(nickname table in common/identity.py) whose names differ by more than a
typo. agent/identity_review.py lists every identity candidate by id and
reason only, and records a named person's decision in the state file and
audit log; nothing is merged automatically.

Scored on Databricks Free Edition (v5 feed, ground truth committed): two
people on one id 14/14; one person under two ids 27/27 same details,
18/18 typo or swapped date, 19/19 nickname or new surname. One pair raised
is two different people sharing a name and birth date. The local DuckDB
replica (now shared with the review queue) matches exactly. Scoring counts
two copies of one person as the same person. The v4 ground truth still
regenerates unchanged.

Co-Authored-By: Claude Opus 5.5 <noreply@anthropic.com>
</commit_message>
<xml_diff>
--- a/docs/workflow_and_tech_stack.docx
+++ b/docs/workflow_and_tech_stack.docx
@@ -148,7 +148,7 @@
                 <w:b w:val="0"/>
                 <w:sz w:val="17"/>
               </w:rPr>
-              <w:t>Runs - regenerated data, every count matches the local prediction; event log records 241 drops, 23 identity flags</w:t>
+              <w:t>Runs - 103,359 simulated events (v5): 306 impossible vitals dropped; four identity checks catch 78/78 planted cases; a steward review queue decides</w:t>
             </w:r>
           </w:p>
         </w:tc>
@@ -10154,7 +10154,7 @@
                 <w:b w:val="0"/>
                 <w:sz w:val="17"/>
               </w:rPr>
-              <w:t>Detect patient identity drift in Silver (same patient_id, new name or birth date)</w:t>
+              <w:t>Unit row filter tested with real workspace groups (a nurse sees only their unit)</w:t>
             </w:r>
           </w:p>
         </w:tc>
@@ -10171,7 +10171,7 @@
                 <w:b w:val="0"/>
                 <w:sz w:val="17"/>
               </w:rPr>
-              <w:t>A pipeline run</w:t>
+              <w:t>Groups in the workspace</w:t>
             </w:r>
           </w:p>
         </w:tc>
@@ -10188,7 +10188,7 @@
                 <w:b w:val="0"/>
                 <w:sz w:val="17"/>
               </w:rPr>
-              <w:t>The EDA defect caught by the pipeline</w:t>
+              <w:t>Row-level access shown, not just column masks</w:t>
             </w:r>
           </w:p>
         </w:tc>
@@ -10224,7 +10224,7 @@
                 <w:b w:val="0"/>
                 <w:sz w:val="17"/>
               </w:rPr>
-              <w:t>Identity matching beyond typos and swapped dates (nicknames, maiden names) with a steward review queue</w:t>
+              <w:t>Feed steward "same person" decisions into a master-patient-index merge (Gold patient key)</w:t>
             </w:r>
           </w:p>
         </w:tc>
@@ -10258,7 +10258,7 @@
                 <w:b w:val="0"/>
                 <w:sz w:val="17"/>
               </w:rPr>
-              <w:t>Fewer missed duplicates, decisions recorded</w:t>
+              <w:t>Counts per person, not per id</w:t>
             </w:r>
           </w:p>
         </w:tc>
@@ -10294,7 +10294,7 @@
                 <w:b w:val="0"/>
                 <w:sz w:val="17"/>
               </w:rPr>
-              <w:t>Healthcheck job on serverless; live pipeline tools run against the workspace</w:t>
+              <w:t>Workspace objects (catalog, volumes, secrets scope, Genie space) as Terraform</w:t>
             </w:r>
           </w:p>
         </w:tc>
@@ -10311,7 +10311,7 @@
                 <w:b w:val="0"/>
                 <w:sz w:val="17"/>
               </w:rPr>
-              <w:t>Databricks login</w:t>
+              <w:t>-</w:t>
             </w:r>
           </w:p>
         </w:tc>
@@ -10328,7 +10328,7 @@
                 <w:b w:val="0"/>
                 <w:sz w:val="17"/>
               </w:rPr>
-              <w:t>The incident workflow running for real</w:t>
+              <w:t>The whole setup reproducible from the repo</w:t>
             </w:r>
           </w:p>
         </w:tc>
@@ -10504,7 +10504,7 @@
                 <w:b w:val="0"/>
                 <w:sz w:val="17"/>
               </w:rPr>
-              <w:t>Before the trial ends: stop everything; cancel the subscription</w:t>
+              <w:t>Cancel the old GCP trial subscription (that workspace is locked)</w:t>
             </w:r>
           </w:p>
         </w:tc>
@@ -10521,7 +10521,7 @@
                 <w:b w:val="0"/>
                 <w:sz w:val="17"/>
               </w:rPr>
-              <w:t>Trial end date; you in GCP Marketplace</w:t>
+              <w:t>You, in GCP Marketplace</w:t>
             </w:r>
           </w:p>
         </w:tc>

</xml_diff>

<commit_message>
Steward decisions become one person key in Gold
identity_review publish copies the decisions to ops.identity_decisions
(one bound JSON parameter), and gold.dim_patient_person gives patient_ids
confirmed as the same person one person_key (the smallest id in the
group, through chains of decisions). The decisions table is created empty
by the governance SQL: serverless pipelines block spark.catalog.tableExists.

Measured on Databricks Free Edition with every candidate decided by a
simulated steward (scripts/simulate_steward.py, ground-truth replay,
recorded under that name): 1,411 patient_ids -> 1,347 people, 64 ids
merged, all to the right person - exactly the ground truth. The 14
shared ids stay flagged; splitting them needs the source system.

The workspace snapshot now reads the latest full refresh: an incremental
update only reports the flows it recomputed.

Co-Authored-By: Claude Opus 5.5 <noreply@anthropic.com>
</commit_message>
<xml_diff>
--- a/docs/workflow_and_tech_stack.docx
+++ b/docs/workflow_and_tech_stack.docx
@@ -10224,7 +10224,7 @@
                 <w:b w:val="0"/>
                 <w:sz w:val="17"/>
               </w:rPr>
-              <w:t>Feed steward "same person" decisions into a master-patient-index merge (Gold patient key)</w:t>
+              <w:t>Split shared patient_ids at source (re-assign the second person's admissions) after a steward confirms</w:t>
             </w:r>
           </w:p>
         </w:tc>
@@ -10241,7 +10241,7 @@
                 <w:b w:val="0"/>
                 <w:sz w:val="17"/>
               </w:rPr>
-              <w:t>-</w:t>
+              <w:t>Source-system access</w:t>
             </w:r>
           </w:p>
         </w:tc>
@@ -10258,7 +10258,7 @@
                 <w:b w:val="0"/>
                 <w:sz w:val="17"/>
               </w:rPr>
-              <w:t>Counts per person, not per id</w:t>
+              <w:t>Shared ids resolved, not just flagged</w:t>
             </w:r>
           </w:p>
         </w:tc>

</xml_diff>

<commit_message>
Workspace setup creates or updates the Genie space too
sync_genie_space --upsert finds the space by its title (following
pagination) and updates it, or creates it on the warehouse; after a create
it waits until the space is listed - the list lagged ~5 s on Free Edition,
which would let a quick re-run create a duplicate. setup_workspace.py runs
it as its last step, so a workspace is now set up from one command.

Live on Free Edition: the existing space was updated; the create path was
tested with a throwaway space, which was then trashed.

Co-Authored-By: Claude Opus 5.5 <noreply@anthropic.com>
</commit_message>
<xml_diff>
--- a/docs/workflow_and_tech_stack.docx
+++ b/docs/workflow_and_tech_stack.docx
@@ -10294,7 +10294,7 @@
                 <w:b w:val="0"/>
                 <w:sz w:val="17"/>
               </w:rPr>
-              <w:t>Create the Genie space from the repo too (scripts/setup_workspace.py covers everything else)</w:t>
+              <w:t>Agent Bricks runbook agent over the problem catalog (104 problems)</w:t>
             </w:r>
           </w:p>
         </w:tc>
@@ -10311,7 +10311,7 @@
                 <w:b w:val="0"/>
                 <w:sz w:val="17"/>
               </w:rPr>
-              <w:t>-</w:t>
+              <w:t>Agent Bricks on the workspace</w:t>
             </w:r>
           </w:p>
         </w:tc>
@@ -10328,7 +10328,7 @@
                 <w:b w:val="0"/>
                 <w:sz w:val="17"/>
               </w:rPr>
-              <w:t>A new workspace from one command</w:t>
+              <w:t>How-to questions answered from the catalog</w:t>
             </w:r>
           </w:p>
         </w:tc>
@@ -10434,7 +10434,7 @@
                 <w:b w:val="0"/>
                 <w:sz w:val="17"/>
               </w:rPr>
-              <w:t>Agent Bricks runbook agent over the problem catalog</w:t>
+              <w:t>Turn on the GitHub -&gt; Databricks stages (validate, deploy on merge, integration run)</w:t>
             </w:r>
           </w:p>
         </w:tc>
@@ -10451,7 +10451,7 @@
                 <w:b w:val="0"/>
                 <w:sz w:val="17"/>
               </w:rPr>
-              <w:t>Workspace</w:t>
+              <w:t>You: DATABRICKS_HOST / DATABRICKS_TOKEN repo secrets</w:t>
             </w:r>
           </w:p>
         </w:tc>
@@ -10468,7 +10468,7 @@
                 <w:b w:val="0"/>
                 <w:sz w:val="17"/>
               </w:rPr>
-              <w:t>How-to questions answered from the catalog</w:t>
+              <w:t>Every merge checked against the real workspace</w:t>
             </w:r>
           </w:p>
         </w:tc>

</xml_diff>

<commit_message>
lookup_problem can rank by runbook search (opt-in); rules planner stays keyword
RUNBOOK_SEARCH=embeddings makes lookup_problem rank catalog problems by rank
fusion of hosted embeddings and its keyword search. Below a 0.55 cosine
floor - between real on-call questions (0.59-0.76) and off-topic ones
(0.37-0.50) - keyword search decides alone, so "no catalog match -
escalate" still happens; any failure falls back to keyword.

Found on the way, live:
- the MCP tool server never saw RUNBOOK_* (only listed prefixes are
  forwarded), so semantic ranking silently fell back - prefix added;
- embeddings alone missed B1 for "plausible_vital_value failing in
  silver_vitals" (why it's fusion, not embeddings alone);
- even fused, M4 ranked above B1 there, and the rules planner acts on the
  top match, so healthcheck switches semantic ranking off for it.

Co-Authored-By: Claude Opus 5.5 <noreply@anthropic.com>
</commit_message>
<xml_diff>
--- a/docs/workflow_and_tech_stack.docx
+++ b/docs/workflow_and_tech_stack.docx
@@ -10294,7 +10294,7 @@
                 <w:b w:val="0"/>
                 <w:sz w:val="17"/>
               </w:rPr>
-              <w:t>Use runbook search (14/15 held-out) inside the agent's lookup_problem when the workspace is reachable</w:t>
+              <w:t>Grow the runbook question set from real incidents; re-check the 0.55 similarity floor on it</w:t>
             </w:r>
           </w:p>
         </w:tc>
@@ -10311,7 +10311,7 @@
                 <w:b w:val="0"/>
                 <w:sz w:val="17"/>
               </w:rPr>
-              <w:t>-</w:t>
+              <w:t>Incident history</w:t>
             </w:r>
           </w:p>
         </w:tc>
@@ -10328,7 +10328,7 @@
                 <w:b w:val="0"/>
                 <w:sz w:val="17"/>
               </w:rPr>
-              <w:t>Better problem matching in health checks</w:t>
+              <w:t>Runbook search measured on real questions, not written ones</w:t>
             </w:r>
           </w:p>
         </w:tc>

</xml_diff>

<commit_message>
Docs: measured results only, plain wording
- Feature table lists what ran and what it showed; the four parts that were
  never deployed (Terraform, Cloud Run, Vector Search client, federation
  example) are named once, after the table.
- Corrected comments that still said the pipeline and Unity Catalog SQL had
  never run; they run on Databricks Free Edition.
- Agent Bricks doc rewritten around what happened: Knowledge Assistant is
  legacy for new accounts, so runbook search was built from hosted models
  (held-out: 14/15 vs 6/15 keyword). Removed the Vertex AI plan, never run.
- Workflow doc: planner row covers the laptop, Databricks and rules
  planners; the "not yet" row is now what isn't deployed.
- Stopped tracking CLAUDE.md (local tool config).
</commit_message>
<xml_diff>
--- a/docs/workflow_and_tech_stack.docx
+++ b/docs/workflow_and_tech_stack.docx
@@ -296,7 +296,7 @@
                 <w:b w:val="0"/>
                 <w:sz w:val="17"/>
               </w:rPr>
-              <w:t>Tested locally - no real week of operation yet</w:t>
+              <w:t>Runs - a live restart on Databricks ran only after a named approval</w:t>
             </w:r>
           </w:p>
         </w:tc>
@@ -389,7 +389,7 @@
                 <w:b w:val="0"/>
                 <w:sz w:val="17"/>
               </w:rPr>
-              <w:t>Not yet</w:t>
+              <w:t>Not deployed</w:t>
             </w:r>
           </w:p>
         </w:tc>
@@ -406,7 +406,7 @@
                 <w:b w:val="0"/>
                 <w:sz w:val="17"/>
               </w:rPr>
-              <w:t>Claude as router (paid key), restart through the live API, Agent Bricks, Terraform, unit row filter with real groups</w:t>
+              <w:t>Terraform and Cloud Run (in the repo, never applied); the unit row filter is deployed but untested with workspace groups</w:t>
             </w:r>
           </w:p>
         </w:tc>
@@ -2247,7 +2247,7 @@
                 <w:b w:val="0"/>
                 <w:sz w:val="17"/>
               </w:rPr>
-              <w:t>Quarantine / restart become pending requests</w:t>
+              <w:t>Quarantine / restart become queued requests</w:t>
             </w:r>
           </w:p>
         </w:tc>
@@ -2599,7 +2599,7 @@
                 <w:b w:val="0"/>
                 <w:sz w:val="17"/>
               </w:rPr>
-              <w:t>Pending, unexpired requests</w:t>
+              <w:t>Queued, unexpired requests</w:t>
             </w:r>
           </w:p>
         </w:tc>
@@ -7004,7 +7004,7 @@
                 <w:b w:val="0"/>
                 <w:sz w:val="17"/>
               </w:rPr>
-              <w:t>Router / LLM</w:t>
+              <w:t>Planner / LLM</w:t>
             </w:r>
           </w:p>
         </w:tc>
@@ -7021,7 +7021,7 @@
                 <w:b w:val="0"/>
                 <w:sz w:val="17"/>
               </w:rPr>
-              <w:t>Anthropic Claude via the Anthropic SDK</w:t>
+              <w:t>Laptop model via Ollama (qwen3:14b), Databricks Model Serving (Qwen 3.5 122B), rules planner; Anthropic SDK optional</w:t>
             </w:r>
           </w:p>
         </w:tc>
@@ -7038,7 +7038,7 @@
                 <w:b w:val="0"/>
                 <w:sz w:val="17"/>
               </w:rPr>
-              <w:t>anthropic 1.7.0</w:t>
+              <w:t>Ollama 0.40, Foundation Model APIs</w:t>
             </w:r>
           </w:p>
         </w:tc>
@@ -7072,7 +7072,7 @@
                 <w:b w:val="0"/>
                 <w:sz w:val="17"/>
               </w:rPr>
-              <w:t>agent/llm.py, agent/orchestrator.py</w:t>
+              <w:t>agent/local_llm.py, agent/databricks_llm.py, agent/orchestrator.py</w:t>
             </w:r>
           </w:p>
         </w:tc>
@@ -7090,7 +7090,7 @@
                 <w:b w:val="0"/>
                 <w:sz w:val="17"/>
               </w:rPr>
-              <w:t>Tested locally (scripted model) - real model needs a paid key</w:t>
+              <w:t>Runs - 14 scenario evals: Qwen 3.5 14/14, qwen3:14b on the laptop 12/14</w:t>
             </w:r>
           </w:p>
         </w:tc>

</xml_diff>